<commit_message>
Adición de justificación al documento inicial
La novedad que está aportando mi TFG es una elección mucho más sencilla y rápida
</commit_message>
<xml_diff>
--- a/Información ELA.docx
+++ b/Información ELA.docx
@@ -26,158 +26,241 @@
           <w:b/>
           <w:bCs/>
         </w:rPr>
-        <w:t xml:space="preserve"> para saber </w:t>
-      </w:r>
-      <w:proofErr w:type="spellStart"/>
+        <w:t xml:space="preserve"> para saber cual escoger</w:t>
+      </w:r>
+    </w:p>
+    <w:p>
+      <w:r>
+        <w:t xml:space="preserve">¿Donde/cuando usará el dispositivo? </w:t>
+      </w:r>
+    </w:p>
+    <w:p>
+      <w:r>
+        <w:t xml:space="preserve">¿Quiere un pequeño dispositivo portátil que produzca frases preprogramadas y respuestas cortas mecanografiadas, o un sistema que le permita escribir, almacenar y decir cualquier cosa que elija? ¿Necesita un dispositivo que sea portátil y se acople a dispositivos de movilidad? </w:t>
+      </w:r>
+    </w:p>
+    <w:p>
+      <w:r>
+        <w:t xml:space="preserve"> ¿Es fácil de usar? </w:t>
+      </w:r>
+    </w:p>
+    <w:p>
+      <w:r>
+        <w:t>¿Es funcional/adecuado para usted? ¿Cómo utilizará el dispositivo si pierde la funcionalidad de la mano?</w:t>
+      </w:r>
+    </w:p>
+    <w:p>
+      <w:r>
+        <w:t xml:space="preserve">Si funciona mal, ¿se puede reparar rápido, fácil y a bajo costo? ¿Tiene acceso a soporte tecnológico local o en línea? </w:t>
+      </w:r>
+    </w:p>
+    <w:p>
+      <w:r>
+        <w:t xml:space="preserve">¿Hay alguien que pueda ayudarle a mantener el dispositivo, cargar las baterías, prenderlo y apagarlo y ayudarle con la programación? </w:t>
+      </w:r>
+    </w:p>
+    <w:p>
+      <w:r>
+        <w:t xml:space="preserve"> ¿Cuáles son sus opciones de presupuesto/financiamiento? </w:t>
+      </w:r>
+    </w:p>
+    <w:p>
+      <w:r>
+        <w:t>¿Se adaptará a sus necesidades mientras el proceso de la enfermedad continua?</w:t>
+      </w:r>
+    </w:p>
+    <w:p/>
+    <w:p>
+      <w:r>
+        <w:t>manual Test COMFOR</w:t>
+      </w:r>
+      <w:r>
+        <w:t xml:space="preserve">. </w:t>
+      </w:r>
+      <w:r>
+        <w:t>Se trata de una prueba para la evaluación de las necesidades de sistemas aumentativos de comunicación en autismo y otras dificultades de Comunicación. Incluye 5 formularios de evaluación originales.</w:t>
+      </w:r>
+      <w:r>
+        <w:t xml:space="preserve"> </w:t>
+      </w:r>
+      <w:r>
+        <w:t xml:space="preserve">Valora </w:t>
+      </w:r>
       <w:r>
         <w:rPr>
           <w:b/>
           <w:bCs/>
         </w:rPr>
-        <w:t>cual</w:t>
-      </w:r>
-      <w:proofErr w:type="spellEnd"/>
+        <w:t>cómo la persona percibe y organiza estímulos</w:t>
+      </w:r>
+      <w:r>
+        <w:t xml:space="preserve"> que pueden convertirse en símbolos de comunicación.</w:t>
+      </w:r>
+      <w:r>
+        <w:t xml:space="preserve"> </w:t>
+      </w:r>
+      <w:r>
+        <w:t xml:space="preserve">Mide el nivel de </w:t>
+      </w:r>
       <w:r>
         <w:rPr>
           <w:b/>
           <w:bCs/>
         </w:rPr>
-        <w:t xml:space="preserve"> escoger</w:t>
-      </w:r>
-    </w:p>
-    <w:p>
-      <w:r>
-        <w:t>¿</w:t>
-      </w:r>
-      <w:proofErr w:type="spellStart"/>
-      <w:r>
-        <w:t>Donde</w:t>
-      </w:r>
-      <w:proofErr w:type="spellEnd"/>
-      <w:r>
-        <w:t xml:space="preserve">/cuando usará el dispositivo? </w:t>
-      </w:r>
-    </w:p>
-    <w:p>
-      <w:r>
-        <w:t xml:space="preserve">¿Quiere un pequeño dispositivo portátil que produzca frases preprogramadas y respuestas cortas mecanografiadas, o un sistema que le permita escribir, almacenar y decir cualquier cosa que elija? ¿Necesita un dispositivo que sea portátil y se acople a dispositivos de movilidad? </w:t>
-      </w:r>
-    </w:p>
-    <w:p>
-      <w:r>
-        <w:t xml:space="preserve"> ¿Es fácil de usar? </w:t>
-      </w:r>
-    </w:p>
-    <w:p>
-      <w:r>
-        <w:t>¿Es funcional/adecuado para usted? ¿Cómo utilizará el dispositivo si pierde la funcionalidad de la mano?</w:t>
-      </w:r>
-    </w:p>
-    <w:p>
-      <w:r>
-        <w:t xml:space="preserve">Si funciona mal, ¿se puede reparar rápido, fácil y a bajo costo? ¿Tiene acceso a soporte tecnológico local o en línea? </w:t>
-      </w:r>
-    </w:p>
-    <w:p>
-      <w:r>
-        <w:t xml:space="preserve">¿Hay alguien que pueda ayudarle a mantener el dispositivo, cargar las baterías, prenderlo y apagarlo y ayudarle con la programación? </w:t>
-      </w:r>
-    </w:p>
-    <w:p>
-      <w:r>
-        <w:t xml:space="preserve"> ¿Cuáles son sus opciones de presupuesto/financiamiento? </w:t>
-      </w:r>
-    </w:p>
-    <w:p>
-      <w:r>
-        <w:t>¿Se adaptará a sus necesidades mientras el proceso de la enfermedad continua?</w:t>
-      </w:r>
-    </w:p>
-    <w:p/>
-    <w:p>
-      <w:r>
-        <w:t>manual Test COMFOR</w:t>
-      </w:r>
-      <w:r>
-        <w:t xml:space="preserve">. </w:t>
-      </w:r>
-      <w:r>
-        <w:t>Se trata de una prueba para la evaluación de las necesidades de sistemas aumentativos de comunicación en autismo y otras dificultades de Comunicación. Incluye 5 formularios de evaluación originales.</w:t>
+        <w:t>comprensión y representación</w:t>
+      </w:r>
+      <w:r>
+        <w:t xml:space="preserve"> de esos estímulos.</w:t>
       </w:r>
       <w:r>
         <w:t xml:space="preserve"> </w:t>
       </w:r>
       <w:r>
-        <w:t xml:space="preserve">Valora </w:t>
+        <w:t xml:space="preserve">Aporta información clave para decidir </w:t>
       </w:r>
       <w:r>
         <w:rPr>
           <w:b/>
           <w:bCs/>
         </w:rPr>
-        <w:t>cómo la persona percibe y organiza estímulos</w:t>
-      </w:r>
-      <w:r>
-        <w:t xml:space="preserve"> que pueden convertirse en símbolos de comunicación.</w:t>
-      </w:r>
-      <w:r>
-        <w:t xml:space="preserve"> </w:t>
-      </w:r>
-      <w:r>
-        <w:t xml:space="preserve">Mide el nivel de </w:t>
+        <w:t>qué tipo de SAAC sería funcionalmente apropiado</w:t>
+      </w:r>
+      <w:r>
+        <w:t xml:space="preserve"> para esa persona</w:t>
+      </w:r>
+      <w:r>
+        <w:t xml:space="preserve">. </w:t>
       </w:r>
       <w:r>
         <w:rPr>
           <w:b/>
           <w:bCs/>
         </w:rPr>
-        <w:t>comprensión y representación</w:t>
-      </w:r>
-      <w:r>
-        <w:t xml:space="preserve"> de esos estímulos.</w:t>
-      </w:r>
-      <w:r>
-        <w:t xml:space="preserve"> </w:t>
-      </w:r>
-      <w:r>
-        <w:t xml:space="preserve">Aporta información clave para decidir </w:t>
+        <w:t>Metodología → instrumentos de evaluación</w:t>
+      </w:r>
+      <w:r>
+        <w:br/>
+        <w:t xml:space="preserve">Describirlo como </w:t>
       </w:r>
       <w:r>
         <w:rPr>
           <w:b/>
           <w:bCs/>
         </w:rPr>
-        <w:t>qué tipo de SAAC sería funcionalmente apropiado</w:t>
-      </w:r>
-      <w:r>
-        <w:t xml:space="preserve"> para esa persona</w:t>
-      </w:r>
-      <w:r>
-        <w:t xml:space="preserve">. </w:t>
-      </w:r>
-      <w:r>
+        <w:t>herramienta estandarizada para seleccionar el SAAC más adecuado según competencias cognitivas y comunicativas</w:t>
+      </w:r>
+      <w:r>
+        <w:t>.</w:t>
+      </w:r>
+    </w:p>
+    <w:p/>
+    <w:p>
+      <w:pPr>
         <w:rPr>
           <w:b/>
           <w:bCs/>
         </w:rPr>
-        <w:t>Metodología → instrumentos de evaluación</w:t>
-      </w:r>
-      <w:r>
-        <w:br/>
-        <w:t xml:space="preserve">Describirlo como </w:t>
-      </w:r>
+      </w:pPr>
       <w:r>
         <w:rPr>
           <w:b/>
           <w:bCs/>
         </w:rPr>
-        <w:t>herramienta estandarizada para seleccionar el SAAC más adecuado según competencias cognitivas y comunicativas</w:t>
-      </w:r>
-      <w:r>
-        <w:t>.</w:t>
-      </w:r>
-    </w:p>
-    <w:p/>
+        <w:t xml:space="preserve">Criterios evaluación SAAC </w:t>
+      </w:r>
+    </w:p>
+    <w:p>
+      <w:pPr>
+        <w:numPr>
+          <w:ilvl w:val="0"/>
+          <w:numId w:val="2"/>
+        </w:numPr>
+      </w:pPr>
+      <w:r>
+        <w:t>Interfaz: Facilidad de uso, carga cognitiva, accesibilidad visual</w:t>
+      </w:r>
+      <w:r>
+        <w:t xml:space="preserve"> (se ve con todas las condiciones de luz, se pueden aumentar el tamaño de los pictogramas si hay discapacidad visual o el volumen o la velocidad con la que se dicen las palabras por discapacidad auditiva)</w:t>
+      </w:r>
+    </w:p>
+    <w:p>
+      <w:pPr>
+        <w:numPr>
+          <w:ilvl w:val="0"/>
+          <w:numId w:val="2"/>
+        </w:numPr>
+      </w:pPr>
+      <w:r>
+        <w:t>Hardware: Necesita pulsadores, mirada, pantalla táctil, sensores</w:t>
+      </w:r>
+    </w:p>
+    <w:p>
+      <w:pPr>
+        <w:numPr>
+          <w:ilvl w:val="0"/>
+          <w:numId w:val="2"/>
+        </w:numPr>
+      </w:pPr>
+      <w:r>
+        <w:t>Software: Personalización, idioma, compatibilidad</w:t>
+      </w:r>
+    </w:p>
+    <w:p>
+      <w:pPr>
+        <w:numPr>
+          <w:ilvl w:val="0"/>
+          <w:numId w:val="2"/>
+        </w:numPr>
+      </w:pPr>
+      <w:r>
+        <w:t>Adaptabilidad: ¿Sirve para distintos niveles de discapacidad?</w:t>
+      </w:r>
+    </w:p>
+    <w:p>
+      <w:pPr>
+        <w:numPr>
+          <w:ilvl w:val="0"/>
+          <w:numId w:val="2"/>
+        </w:numPr>
+      </w:pPr>
+      <w:r>
+        <w:t>Portabilidad: ¿Es muy pesado? ¿Aparatoso? ¿Puede utilizarse tanto en casa, la escuela y la calle?</w:t>
+      </w:r>
+    </w:p>
+    <w:p>
+      <w:pPr>
+        <w:numPr>
+          <w:ilvl w:val="0"/>
+          <w:numId w:val="2"/>
+        </w:numPr>
+      </w:pPr>
+      <w:r>
+        <w:lastRenderedPageBreak/>
+        <w:t>Coste: Precio del sistema y mantenimiento</w:t>
+      </w:r>
+    </w:p>
+    <w:p>
+      <w:pPr>
+        <w:numPr>
+          <w:ilvl w:val="0"/>
+          <w:numId w:val="2"/>
+        </w:numPr>
+      </w:pPr>
+      <w:r>
+        <w:t>Robustez: ¿Tiene fallos? ¿Depende de batería?</w:t>
+      </w:r>
+    </w:p>
+    <w:p>
+      <w:pPr>
+        <w:numPr>
+          <w:ilvl w:val="0"/>
+          <w:numId w:val="2"/>
+        </w:numPr>
+      </w:pPr>
+      <w:r>
+        <w:t>Curva de aprendizaje: Tanto para usuarios como cuidadores, ¿es fácil aprender a usarlo? ¿Lleva mucho tiempo?</w:t>
+      </w:r>
+    </w:p>
     <w:p>
       <w:pPr>
         <w:rPr>
@@ -185,148 +268,31 @@
           <w:bCs/>
         </w:rPr>
       </w:pPr>
-      <w:r>
+    </w:p>
+    <w:p/>
+    <w:p>
+      <w:pPr>
         <w:rPr>
           <w:b/>
           <w:bCs/>
         </w:rPr>
-        <w:t xml:space="preserve">Criterios evaluación SAAC </w:t>
-      </w:r>
-    </w:p>
-    <w:p>
-      <w:pPr>
-        <w:numPr>
-          <w:ilvl w:val="0"/>
-          <w:numId w:val="2"/>
-        </w:numPr>
-      </w:pPr>
-      <w:r>
-        <w:t>Interfaz: Facilidad de uso, carga cognitiva, accesibilidad visual</w:t>
-      </w:r>
-      <w:r>
-        <w:t xml:space="preserve"> (se ve con todas las condiciones de luz, se pueden aumentar el tamaño de los pictogramas si hay discapacidad visual o el volumen o la velocidad con la que se dicen las palabras por discapacidad auditiva)</w:t>
-      </w:r>
-    </w:p>
-    <w:p>
-      <w:pPr>
-        <w:numPr>
-          <w:ilvl w:val="0"/>
-          <w:numId w:val="2"/>
-        </w:numPr>
-      </w:pPr>
-      <w:r>
-        <w:t>Hardware: Necesita pulsadores, mirada, pantalla táctil, sensores</w:t>
-      </w:r>
-    </w:p>
-    <w:p>
-      <w:pPr>
-        <w:numPr>
-          <w:ilvl w:val="0"/>
-          <w:numId w:val="2"/>
-        </w:numPr>
-      </w:pPr>
-      <w:r>
-        <w:t>Software: Personalización, idioma, compatibilidad</w:t>
-      </w:r>
-    </w:p>
-    <w:p>
-      <w:pPr>
-        <w:numPr>
-          <w:ilvl w:val="0"/>
-          <w:numId w:val="2"/>
-        </w:numPr>
-      </w:pPr>
-      <w:r>
-        <w:t>Adaptabilidad: ¿Sirve para distintos niveles de discapacidad?</w:t>
-      </w:r>
-    </w:p>
-    <w:p>
-      <w:pPr>
-        <w:numPr>
-          <w:ilvl w:val="0"/>
-          <w:numId w:val="2"/>
-        </w:numPr>
-      </w:pPr>
-      <w:r>
-        <w:t>Portabilidad: ¿Es muy pesado? ¿Aparatoso? ¿Puede utilizarse tanto en casa, la escuela y la calle?</w:t>
-      </w:r>
-    </w:p>
-    <w:p>
-      <w:pPr>
-        <w:numPr>
-          <w:ilvl w:val="0"/>
-          <w:numId w:val="2"/>
-        </w:numPr>
-      </w:pPr>
-      <w:r>
-        <w:lastRenderedPageBreak/>
-        <w:t>Coste: Precio del sistema y mantenimiento</w:t>
-      </w:r>
-    </w:p>
-    <w:p>
-      <w:pPr>
-        <w:numPr>
-          <w:ilvl w:val="0"/>
-          <w:numId w:val="2"/>
-        </w:numPr>
-      </w:pPr>
-      <w:r>
-        <w:t>Robustez: ¿Tiene fallos? ¿Depende de batería?</w:t>
-      </w:r>
-    </w:p>
-    <w:p>
-      <w:pPr>
-        <w:numPr>
-          <w:ilvl w:val="0"/>
-          <w:numId w:val="2"/>
-        </w:numPr>
-      </w:pPr>
-      <w:r>
-        <w:t>Curva de aprendizaje: Tanto para usuarios como cuidadores, ¿es fácil aprender a usarlo? ¿Lleva mucho tiempo?</w:t>
-      </w:r>
-    </w:p>
-    <w:p>
-      <w:pPr>
+      </w:pPr>
+      <w:r>
         <w:rPr>
           <w:b/>
           <w:bCs/>
         </w:rPr>
-      </w:pPr>
-    </w:p>
-    <w:p/>
-    <w:p>
-      <w:pPr>
-        <w:rPr>
-          <w:b/>
-          <w:bCs/>
-        </w:rPr>
-      </w:pPr>
-      <w:r>
-        <w:rPr>
-          <w:b/>
-          <w:bCs/>
-        </w:rPr>
         <w:t>Etapas ELA</w:t>
       </w:r>
     </w:p>
     <w:p>
-      <w:proofErr w:type="spellStart"/>
-      <w:r>
-        <w:t>Funcion</w:t>
-      </w:r>
-      <w:proofErr w:type="spellEnd"/>
-      <w:r>
-        <w:t xml:space="preserve"> de la mano intacta</w:t>
-      </w:r>
-    </w:p>
-    <w:p>
-      <w:proofErr w:type="spellStart"/>
-      <w:r>
-        <w:t>Funcion</w:t>
-      </w:r>
-      <w:proofErr w:type="spellEnd"/>
-      <w:r>
-        <w:t xml:space="preserve"> de la mano deteriorada</w:t>
+      <w:r>
+        <w:t>Funcion de la mano intacta</w:t>
+      </w:r>
+    </w:p>
+    <w:p>
+      <w:r>
+        <w:t>Funcion de la mano deteriorada</w:t>
       </w:r>
     </w:p>
     <w:p/>
@@ -819,13 +785,8 @@
           <w:numId w:val="1"/>
         </w:numPr>
       </w:pPr>
-      <w:proofErr w:type="spellStart"/>
-      <w:r>
-        <w:t>Tecnologia</w:t>
-      </w:r>
-      <w:proofErr w:type="spellEnd"/>
-      <w:r>
-        <w:t xml:space="preserve"> media: Dispositivos sencillos con grabación manual de mensajes</w:t>
+      <w:r>
+        <w:t>Tecnologia media: Dispositivos sencillos con grabación manual de mensajes</w:t>
       </w:r>
     </w:p>
     <w:p>
@@ -920,15 +881,7 @@
       </w:pPr>
       <w:r>
         <w:lastRenderedPageBreak/>
-        <w:t xml:space="preserve">Compactación semántica: </w:t>
-      </w:r>
-      <w:proofErr w:type="spellStart"/>
-      <w:r>
-        <w:t>Minspeak</w:t>
-      </w:r>
-      <w:proofErr w:type="spellEnd"/>
-      <w:r>
-        <w:t xml:space="preserve">: </w:t>
+        <w:t xml:space="preserve">Compactación semántica: Minspeak: </w:t>
       </w:r>
       <w:r>
         <w:t>Inspirado en los jeroglíficos</w:t>
@@ -1048,15 +1001,7 @@
         </w:numPr>
       </w:pPr>
       <w:r>
-        <w:t xml:space="preserve">Frecuencia: Palabras </w:t>
-      </w:r>
-      <w:proofErr w:type="spellStart"/>
-      <w:r>
-        <w:t>mas</w:t>
-      </w:r>
-      <w:proofErr w:type="spellEnd"/>
-      <w:r>
-        <w:t xml:space="preserve"> usadas primero</w:t>
+        <w:t>Frecuencia: Palabras mas usadas primero</w:t>
       </w:r>
     </w:p>
     <w:p>
@@ -1076,15 +1021,7 @@
         <w:t xml:space="preserve">Sistema pictográfico de la comunicación SPC: </w:t>
       </w:r>
       <w:r>
-        <w:t xml:space="preserve"> dibujos sencillos sobre las categorías gente, comida, ropa, aseo, cuerpo, salud, ocio, limpieza, cocina, hogar, lugares, trabajo, escuela, animales, transporte…, en definitiva, conceptos comunes para la comunicación cotidiana. SPC propuso la organización </w:t>
-      </w:r>
-      <w:proofErr w:type="spellStart"/>
-      <w:r>
-        <w:t>organización</w:t>
-      </w:r>
-      <w:proofErr w:type="spellEnd"/>
-      <w:r>
-        <w:t xml:space="preserve"> del vocabulario por categorías semánticas al combinar tipos de palabras (sustantivos, verbos, adjetivos) con campos semánticos (lugares, días de la semana, colegio, muebles…).</w:t>
+        <w:t> dibujos sencillos sobre las categorías gente, comida, ropa, aseo, cuerpo, salud, ocio, limpieza, cocina, hogar, lugares, trabajo, escuela, animales, transporte…, en definitiva, conceptos comunes para la comunicación cotidiana. SPC propuso la organización organización del vocabulario por categorías semánticas al combinar tipos de palabras (sustantivos, verbos, adjetivos) con campos semánticos (lugares, días de la semana, colegio, muebles…).</w:t>
       </w:r>
     </w:p>
     <w:p>
@@ -1095,13 +1032,8 @@
           <w:numId w:val="1"/>
         </w:numPr>
       </w:pPr>
-      <w:proofErr w:type="spellStart"/>
-      <w:r>
-        <w:t>Widgit</w:t>
-      </w:r>
-      <w:proofErr w:type="spellEnd"/>
-      <w:r>
-        <w:t xml:space="preserve">: </w:t>
+      <w:r>
+        <w:t xml:space="preserve">Widgit: </w:t>
       </w:r>
       <w:r>
         <w:t>al tiempo que se escribe un texto, se va asignando una imagen automáticamente a cada palabra. Hoy día hay otros traductores de texto a imagen, aunque la calidad depende del idioma y de la complejidad del mensaje</w:t>
@@ -1130,11 +1062,9 @@
           <w:numId w:val="1"/>
         </w:numPr>
       </w:pPr>
-      <w:proofErr w:type="spellStart"/>
       <w:r>
         <w:t>Symbolstix</w:t>
       </w:r>
-      <w:proofErr w:type="spellEnd"/>
       <w:r>
         <w:t xml:space="preserve">: </w:t>
       </w:r>
@@ -1314,7 +1244,183 @@
         </w:r>
       </w:hyperlink>
     </w:p>
-    <w:p/>
+    <w:p>
+      <w:r>
+        <w:t>Justificacion</w:t>
+      </w:r>
+    </w:p>
+    <w:p>
+      <w:hyperlink r:id="rId7" w:history="1">
+        <w:r>
+          <w:rPr>
+            <w:rStyle w:val="Hipervnculo"/>
+          </w:rPr>
+          <w:t>https://www.elaandalucia.es/wp-content/uploads/2023/02/publication.pdf</w:t>
+        </w:r>
+      </w:hyperlink>
+      <w:r>
+        <w:t xml:space="preserve"> consulta</w:t>
+      </w:r>
+      <w:r>
+        <w:t xml:space="preserve">r </w:t>
+      </w:r>
+    </w:p>
+    <w:p>
+      <w:r>
+        <w:rPr>
+          <w:i/>
+          <w:iCs/>
+        </w:rPr>
+        <w:t xml:space="preserve">Las guías existentes son completas y clínicamente rigurosas, pero </w:t>
+      </w:r>
+      <w:r>
+        <w:rPr>
+          <w:b/>
+          <w:bCs/>
+          <w:i/>
+          <w:iCs/>
+        </w:rPr>
+        <w:t>no están diseñadas como herramientas de apoyo a la decisión técnica</w:t>
+      </w:r>
+      <w:r>
+        <w:t>.</w:t>
+      </w:r>
+    </w:p>
+    <w:p>
+      <w:pPr>
+        <w:rPr>
+          <w:b/>
+          <w:bCs/>
+        </w:rPr>
+      </w:pPr>
+      <w:r>
+        <w:rPr>
+          <w:b/>
+          <w:bCs/>
+        </w:rPr>
+        <w:t>Las guías existentes (como la de ELA Andalucía)</w:t>
+      </w:r>
+    </w:p>
+    <w:p>
+      <w:pPr>
+        <w:numPr>
+          <w:ilvl w:val="0"/>
+          <w:numId w:val="11"/>
+        </w:numPr>
+      </w:pPr>
+      <w:r>
+        <w:t xml:space="preserve">Documento </w:t>
+      </w:r>
+      <w:r>
+        <w:rPr>
+          <w:b/>
+          <w:bCs/>
+        </w:rPr>
+        <w:t>estático</w:t>
+      </w:r>
+    </w:p>
+    <w:p>
+      <w:pPr>
+        <w:numPr>
+          <w:ilvl w:val="0"/>
+          <w:numId w:val="11"/>
+        </w:numPr>
+      </w:pPr>
+      <w:r>
+        <w:t>Pensado para:</w:t>
+      </w:r>
+    </w:p>
+    <w:p>
+      <w:pPr>
+        <w:numPr>
+          <w:ilvl w:val="1"/>
+          <w:numId w:val="11"/>
+        </w:numPr>
+      </w:pPr>
+      <w:r>
+        <w:t>Lectura secuencial</w:t>
+      </w:r>
+    </w:p>
+    <w:p>
+      <w:pPr>
+        <w:numPr>
+          <w:ilvl w:val="1"/>
+          <w:numId w:val="11"/>
+        </w:numPr>
+      </w:pPr>
+      <w:r>
+        <w:t>Profesionales y familiares con tiempo y formación</w:t>
+      </w:r>
+    </w:p>
+    <w:p>
+      <w:pPr>
+        <w:numPr>
+          <w:ilvl w:val="0"/>
+          <w:numId w:val="11"/>
+        </w:numPr>
+      </w:pPr>
+      <w:r>
+        <w:t>Presenta:</w:t>
+      </w:r>
+    </w:p>
+    <w:p>
+      <w:pPr>
+        <w:numPr>
+          <w:ilvl w:val="1"/>
+          <w:numId w:val="11"/>
+        </w:numPr>
+      </w:pPr>
+      <w:r>
+        <w:t>Mucha información</w:t>
+      </w:r>
+    </w:p>
+    <w:p>
+      <w:pPr>
+        <w:numPr>
+          <w:ilvl w:val="1"/>
+          <w:numId w:val="11"/>
+        </w:numPr>
+      </w:pPr>
+      <w:r>
+        <w:t>Requiere interpretación experta</w:t>
+      </w:r>
+    </w:p>
+    <w:p>
+      <w:pPr>
+        <w:numPr>
+          <w:ilvl w:val="0"/>
+          <w:numId w:val="11"/>
+        </w:numPr>
+      </w:pPr>
+      <w:r>
+        <w:rPr>
+          <w:b/>
+          <w:bCs/>
+        </w:rPr>
+        <w:t>No prioriza ni filtra automáticamente</w:t>
+      </w:r>
+    </w:p>
+    <w:p>
+      <w:r>
+        <w:rPr>
+          <w:rFonts w:ascii="Segoe UI Emoji" w:hAnsi="Segoe UI Emoji" w:cs="Segoe UI Emoji"/>
+        </w:rPr>
+        <w:t>👉</w:t>
+      </w:r>
+      <w:r>
+        <w:t xml:space="preserve"> Son necesarias, pero </w:t>
+      </w:r>
+      <w:r>
+        <w:rPr>
+          <w:b/>
+          <w:bCs/>
+        </w:rPr>
+        <w:t>no operativas</w:t>
+      </w:r>
+      <w:r>
+        <w:t xml:space="preserve"> para la toma rápida de decisiones.</w:t>
+      </w:r>
+    </w:p>
     <w:p/>
     <w:sectPr>
       <w:pgSz w:w="11906" w:h="16838"/>
@@ -2375,6 +2481,155 @@
     </w:lvl>
   </w:abstractNum>
   <w:abstractNum w:abstractNumId="8" w15:restartNumberingAfterBreak="0">
+    <w:nsid w:val="45CF6C49"/>
+    <w:multiLevelType w:val="multilevel"/>
+    <w:tmpl w:val="EED60A04"/>
+    <w:lvl w:ilvl="0">
+      <w:start w:val="1"/>
+      <w:numFmt w:val="bullet"/>
+      <w:lvlText w:val=""/>
+      <w:lvlJc w:val="left"/>
+      <w:pPr>
+        <w:tabs>
+          <w:tab w:val="num" w:pos="720"/>
+        </w:tabs>
+        <w:ind w:left="720" w:hanging="360"/>
+      </w:pPr>
+      <w:rPr>
+        <w:rFonts w:ascii="Symbol" w:hAnsi="Symbol" w:hint="default"/>
+        <w:sz w:val="20"/>
+      </w:rPr>
+    </w:lvl>
+    <w:lvl w:ilvl="1">
+      <w:start w:val="1"/>
+      <w:numFmt w:val="bullet"/>
+      <w:lvlText w:val="o"/>
+      <w:lvlJc w:val="left"/>
+      <w:pPr>
+        <w:tabs>
+          <w:tab w:val="num" w:pos="1440"/>
+        </w:tabs>
+        <w:ind w:left="1440" w:hanging="360"/>
+      </w:pPr>
+      <w:rPr>
+        <w:rFonts w:ascii="Courier New" w:hAnsi="Courier New" w:hint="default"/>
+        <w:sz w:val="20"/>
+      </w:rPr>
+    </w:lvl>
+    <w:lvl w:ilvl="2" w:tentative="1">
+      <w:start w:val="1"/>
+      <w:numFmt w:val="bullet"/>
+      <w:lvlText w:val=""/>
+      <w:lvlJc w:val="left"/>
+      <w:pPr>
+        <w:tabs>
+          <w:tab w:val="num" w:pos="2160"/>
+        </w:tabs>
+        <w:ind w:left="2160" w:hanging="360"/>
+      </w:pPr>
+      <w:rPr>
+        <w:rFonts w:ascii="Wingdings" w:hAnsi="Wingdings" w:hint="default"/>
+        <w:sz w:val="20"/>
+      </w:rPr>
+    </w:lvl>
+    <w:lvl w:ilvl="3" w:tentative="1">
+      <w:start w:val="1"/>
+      <w:numFmt w:val="bullet"/>
+      <w:lvlText w:val=""/>
+      <w:lvlJc w:val="left"/>
+      <w:pPr>
+        <w:tabs>
+          <w:tab w:val="num" w:pos="2880"/>
+        </w:tabs>
+        <w:ind w:left="2880" w:hanging="360"/>
+      </w:pPr>
+      <w:rPr>
+        <w:rFonts w:ascii="Wingdings" w:hAnsi="Wingdings" w:hint="default"/>
+        <w:sz w:val="20"/>
+      </w:rPr>
+    </w:lvl>
+    <w:lvl w:ilvl="4" w:tentative="1">
+      <w:start w:val="1"/>
+      <w:numFmt w:val="bullet"/>
+      <w:lvlText w:val=""/>
+      <w:lvlJc w:val="left"/>
+      <w:pPr>
+        <w:tabs>
+          <w:tab w:val="num" w:pos="3600"/>
+        </w:tabs>
+        <w:ind w:left="3600" w:hanging="360"/>
+      </w:pPr>
+      <w:rPr>
+        <w:rFonts w:ascii="Wingdings" w:hAnsi="Wingdings" w:hint="default"/>
+        <w:sz w:val="20"/>
+      </w:rPr>
+    </w:lvl>
+    <w:lvl w:ilvl="5" w:tentative="1">
+      <w:start w:val="1"/>
+      <w:numFmt w:val="bullet"/>
+      <w:lvlText w:val=""/>
+      <w:lvlJc w:val="left"/>
+      <w:pPr>
+        <w:tabs>
+          <w:tab w:val="num" w:pos="4320"/>
+        </w:tabs>
+        <w:ind w:left="4320" w:hanging="360"/>
+      </w:pPr>
+      <w:rPr>
+        <w:rFonts w:ascii="Wingdings" w:hAnsi="Wingdings" w:hint="default"/>
+        <w:sz w:val="20"/>
+      </w:rPr>
+    </w:lvl>
+    <w:lvl w:ilvl="6" w:tentative="1">
+      <w:start w:val="1"/>
+      <w:numFmt w:val="bullet"/>
+      <w:lvlText w:val=""/>
+      <w:lvlJc w:val="left"/>
+      <w:pPr>
+        <w:tabs>
+          <w:tab w:val="num" w:pos="5040"/>
+        </w:tabs>
+        <w:ind w:left="5040" w:hanging="360"/>
+      </w:pPr>
+      <w:rPr>
+        <w:rFonts w:ascii="Wingdings" w:hAnsi="Wingdings" w:hint="default"/>
+        <w:sz w:val="20"/>
+      </w:rPr>
+    </w:lvl>
+    <w:lvl w:ilvl="7" w:tentative="1">
+      <w:start w:val="1"/>
+      <w:numFmt w:val="bullet"/>
+      <w:lvlText w:val=""/>
+      <w:lvlJc w:val="left"/>
+      <w:pPr>
+        <w:tabs>
+          <w:tab w:val="num" w:pos="5760"/>
+        </w:tabs>
+        <w:ind w:left="5760" w:hanging="360"/>
+      </w:pPr>
+      <w:rPr>
+        <w:rFonts w:ascii="Wingdings" w:hAnsi="Wingdings" w:hint="default"/>
+        <w:sz w:val="20"/>
+      </w:rPr>
+    </w:lvl>
+    <w:lvl w:ilvl="8" w:tentative="1">
+      <w:start w:val="1"/>
+      <w:numFmt w:val="bullet"/>
+      <w:lvlText w:val=""/>
+      <w:lvlJc w:val="left"/>
+      <w:pPr>
+        <w:tabs>
+          <w:tab w:val="num" w:pos="6480"/>
+        </w:tabs>
+        <w:ind w:left="6480" w:hanging="360"/>
+      </w:pPr>
+      <w:rPr>
+        <w:rFonts w:ascii="Wingdings" w:hAnsi="Wingdings" w:hint="default"/>
+        <w:sz w:val="20"/>
+      </w:rPr>
+    </w:lvl>
+  </w:abstractNum>
+  <w:abstractNum w:abstractNumId="9" w15:restartNumberingAfterBreak="0">
     <w:nsid w:val="4CBA44EC"/>
     <w:multiLevelType w:val="multilevel"/>
     <w:tmpl w:val="BAA291E4"/>
@@ -2523,7 +2778,7 @@
       </w:rPr>
     </w:lvl>
   </w:abstractNum>
-  <w:abstractNum w:abstractNumId="9" w15:restartNumberingAfterBreak="0">
+  <w:abstractNum w:abstractNumId="10" w15:restartNumberingAfterBreak="0">
     <w:nsid w:val="647E1076"/>
     <w:multiLevelType w:val="multilevel"/>
     <w:tmpl w:val="7AA48B52"/>
@@ -2643,7 +2898,7 @@
     <w:abstractNumId w:val="7"/>
   </w:num>
   <w:num w:numId="3" w16cid:durableId="734545575">
-    <w:abstractNumId w:val="9"/>
+    <w:abstractNumId w:val="10"/>
   </w:num>
   <w:num w:numId="4" w16cid:durableId="79914528">
     <w:abstractNumId w:val="1"/>
@@ -2658,13 +2913,16 @@
     <w:abstractNumId w:val="5"/>
   </w:num>
   <w:num w:numId="8" w16cid:durableId="777480799">
-    <w:abstractNumId w:val="8"/>
+    <w:abstractNumId w:val="9"/>
   </w:num>
   <w:num w:numId="9" w16cid:durableId="300043535">
     <w:abstractNumId w:val="6"/>
   </w:num>
   <w:num w:numId="10" w16cid:durableId="1614676527">
     <w:abstractNumId w:val="4"/>
+  </w:num>
+  <w:num w:numId="11" w16cid:durableId="1150974729">
+    <w:abstractNumId w:val="8"/>
   </w:num>
 </w:numbering>
 </file>

</xml_diff>